<commit_message>
Bio 1.4 Chemicals of Life — complete generation
- All 6 lessons generated via batch API
- Final Explanation and Summary Table included
- Lesson 4 food tests regenerated (JSON fix)
- Batch mode pipeline working end-to-end
- scripts/patch_batch_mode.py — batch API support
- scripts/fix_lesson4.py — lesson repair utility
</commit_message>
<xml_diff>
--- a/data/outputs/docx/Grade 10 Biology/Bio 1.4/Biology_Chemicals_of_Life_FinalExplanation.docx
+++ b/data/outputs/docx/Grade 10 Biology/Bio 1.4/Biology_Chemicals_of_Life_FinalExplanation.docx
@@ -95,7 +95,7 @@
                 <w:sz w:val="22"/>
                 <w:szCs w:val="22"/>
               </w:rPr>
-              <w:t xml:space="preserve">FINAL EXPLANATION: CHEMICALS OF LIFE</w:t>
+              <w:t xml:space="preserve">FINAL EXPLANATION: BIOLOGY GRADE 10 — CHEMICALS OF LIFE</w:t>
             </w:r>
           </w:p>
         </w:tc>
@@ -422,7 +422,7 @@
                 <w:sz w:val="18"/>
                 <w:szCs w:val="18"/>
               </w:rPr>
-              <w:t xml:space="preserve">This is your Final Explanation Task for Sub-strand 1.4: Chemicals of Life. You have spent six lessons investigating the chemicals found in Kenyan foods, conducting food tests in the laboratory, exploring enzyme activity, and building a model to explain why different foods behave differently in the body. Now it is time to show what you have learned by writing a full scientific explanation. Use your completed Summary Table, your notes from the food tests practical (Lesson 4), your model diagrams, and all class observations to support your answers. Your explanation must directly address the phenomenon: why did the student feel sustained energy after ugali, sukuma wiki, and nyama choma, but a quick burst and then tiredness after mandazi and soda? Connect every section back to this phenomenon using real evidence from your experiments and lessons. Include specific Kenyan food examples, name the chemicals of life and their monomer building blocks where relevant, describe experimental evidence from food tests, explain enzyme action with reference to factors affecting activity, and connect molecular structure to biological function throughout. Your Final Explanation must be a minimum of 300 words in total across all sections, written in clear scientific language appropriate for Grade 10.</w:t>
+              <w:t xml:space="preserve">This Final Explanation assessment asks you to bring together everything you have learned across all six lessons in the Chemicals of Life unit. You will use evidence from class activities, experiments, readings, and discussions to construct a full scientific explanation of why our bodies need specific chemicals from food and what happens at the molecular level when those chemicals are present or missing. Read each section prompt carefully before writing. Your answers should go beyond listing facts — you must explain mechanisms, use scientific vocabulary correctly, connect ideas across the unit, and refer back to the anchoring phenomenon of the two children in Nairobi whose diets and health outcomes are so different. Where possible, support your explanations with specific examples from Kenya (foods, conditions, scientists, or contexts discussed in class). Write in complete sentences and organise your ideas clearly. This assessment is your opportunity to show the depth of your understanding, so take your time, refer to your notes and models, and explain your thinking as fully as you can.</w:t>
             </w:r>
           </w:p>
         </w:tc>
@@ -483,7 +483,7 @@
                 <w:sz w:val="22"/>
                 <w:szCs w:val="22"/>
               </w:rPr>
-              <w:t xml:space="preserve">SECTION 1: THE CHEMICALS OF LIFE — IDENTITY AND STRUCTURE</w:t>
+              <w:t xml:space="preserve">SECTION 1: THE CHEMICALS OF LIFE AND THEIR ROLES</w:t>
             </w:r>
           </w:p>
         </w:tc>
@@ -517,7 +517,7 @@
                 <w:sz w:val="18"/>
                 <w:szCs w:val="18"/>
               </w:rPr>
-              <w:t xml:space="preserve">Identify and describe the main chemicals of life found in food. For each chemical (carbohydrates, proteins, lipids, water, and mineral salts), state its basic molecular structure or building blocks, name at least one Kenyan food source, and explain what makes each chemically distinct. Reference the food labels from the phenomenon (uji flour vs. glucose biscuits) to illustrate the difference between complex and simple chemicals.</w:t>
+              <w:t xml:space="preserve">Identify the major biological macromolecules found in food and explain the specific structural and functional role each one plays in the human body. Use the two children from the anchoring phenomenon to illustrate how the presence or absence of each macromolecule leads to observable differences in growth, energy, immunity, and overall health. In your answer, refer to specific Kenyan foods that supply each macromolecule.</w:t>
             </w:r>
           </w:p>
         </w:tc>
@@ -549,45 +549,7 @@
                 <w:sz w:val="18"/>
                 <w:szCs w:val="18"/>
               </w:rPr>
-              <w:t xml:space="preserve">The chemicals of life are the biological molecules found in all living organisms and in the food we eat. They include carbohydrates, proteins, lipids, water, and mineral salts. Carbohydrates are made of carbon, hydrogen, and oxygen, and their building blocks (monomers) are simple sugars called monosaccharides — glucose being the most important. Simple carbohydrates like the sugars listed on the glucose biscuit packet are already monosaccharides or disaccharides, meaning they require little or no digestion. Complex carbohydrates like starch — found in ugali made from maize flour — are polysaccharides: long chains of hundreds of glucose units bonded together by glycosidic bonds, which must be broken down before the body can use them. This structural difference is exactly why the two food labels looked so different: uji flour lists complex carbohydrates and other macromolecules, while glucose biscuits list almost entirely sugars.</w:t>
-            </w:r>
-          </w:p>
-          <w:p>
-            <w:pPr>
-              <w:spacing w:after="40" w:before="0"/>
-              <w:jc w:val="left"/>
-            </w:pPr>
-            <w:r>
-              <w:rPr>
-                <w:rFonts w:ascii="Arial" w:cs="Arial" w:eastAsia="Arial" w:hAnsi="Arial"/>
-                <w:b w:val="false"/>
-                <w:bCs w:val="false"/>
-                <w:i w:val="false"/>
-                <w:iCs w:val="false"/>
-                <w:color w:val="000000"/>
-                <w:sz w:val="18"/>
-                <w:szCs w:val="18"/>
-              </w:rPr>
-              <w:t xml:space="preserve"/>
-            </w:r>
-          </w:p>
-          <w:p>
-            <w:pPr>
-              <w:spacing w:after="40" w:before="0"/>
-              <w:jc w:val="left"/>
-            </w:pPr>
-            <w:r>
-              <w:rPr>
-                <w:rFonts w:ascii="Arial" w:cs="Arial" w:eastAsia="Arial" w:hAnsi="Arial"/>
-                <w:b w:val="false"/>
-                <w:bCs w:val="false"/>
-                <w:i w:val="false"/>
-                <w:iCs w:val="false"/>
-                <w:color w:val="000000"/>
-                <w:sz w:val="18"/>
-                <w:szCs w:val="18"/>
-              </w:rPr>
-              <w:t xml:space="preserve">Proteins are large, complex molecules whose monomers are amino acids joined by peptide bonds. Different sequences and numbers of amino acids produce different proteins with unique three-dimensional shapes. Nyama choma (grilled meat) and beans from githeri are excellent Kenyan sources of protein. Lipids — found in cooking fat used to fry mandazi, and in the natural oils in sukuma wiki — are made of glycerol and fatty acid chains; unlike carbohydrates and proteins, they are not true polymers but their long hydrocarbon tails make them energy-dense and hydrophobic. Water, though often overlooked, is the universal solvent inside all cells and makes up the majority of blood and cytoplasm. Mineral salts such as calcium (found in milk used in uji) and iron (found in sukuma wiki) are inorganic ions that do not provide energy but serve critical structural and regulatory roles. Together, these chemicals form the molecular foundation of every living cell.</w:t>
+              <w:t xml:space="preserve">Living organisms depend on four major classes of biological macromolecules: carbohydrates, proteins, lipids, and nucleic acids — alongside water and mineral ions. Carbohydrates, such as the starch found in ugali and githeri, serve as the body's primary energy source. Glucose molecules are broken down during cellular respiration to release ATP, the energy currency of the cell. Without sufficient carbohydrate intake, the body cannot fuel basic metabolic processes. However, eating only ugali — as the brother in our phenomenon largely does — means the body receives energy but lacks the raw materials needed for growth and repair. Proteins, found in beans, eggs, milk, and nyama choma, are polymers of amino acids linked by peptide bonds. They serve structural roles (building muscle fibres and connective tissue), regulatory roles (as hormones such as insulin), transport roles (haemoglobin carries oxygen in red blood cells), and critical defensive roles (antibodies are glycoproteins that identify and neutralise pathogens). The brother who eats little protein cannot synthesise adequate antibodies or build muscle tissue, which directly explains why he is smaller, weaker, and falls sick more often. Lipids, found in milk fat and meat, form the phospholipid bilayer of every cell membrane, insulate nerves, and store long-term energy. Nucleic acids — DNA and RNA — store and transmit genetic information and direct protein synthesis through transcription and translation. Although nucleic acids are not dietary supplements in the traditional sense, the nitrogen, phosphorus, and carbon needed to build them must come from the food we eat. The neighbour's child, eating a varied diet of githeri, sukuma wiki, milk, and occasional nyama choma, receives all four macromolecule classes and is therefore able to grow, maintain immunity, and recover quickly from illness.</w:t>
             </w:r>
           </w:p>
         </w:tc>
@@ -648,7 +610,7 @@
                 <w:sz w:val="22"/>
                 <w:szCs w:val="22"/>
               </w:rPr>
-              <w:t xml:space="preserve">SECTION 2: FUNCTIONS OF THE CHEMICALS OF LIFE IN THE BODY</w:t>
+              <w:t xml:space="preserve">SECTION 2: MOLECULAR STRUCTURE AND FUNCTION</w:t>
             </w:r>
           </w:p>
         </w:tc>
@@ -682,7 +644,7 @@
                 <w:sz w:val="18"/>
                 <w:szCs w:val="18"/>
               </w:rPr>
-              <w:t xml:space="preserve">Explain the specific roles of each chemical of life inside a living organism. Include the role of carbohydrates in energy supply, proteins in growth and repair, lipids in long-term energy storage and insulation, water as a solvent and transport medium, and mineral salts in body processes. Use the phenomenon to explain why ugali, sukuma wiki, and nyama choma together provide more sustained and complete nutrition than mandazi and soda.</w:t>
+              <w:t xml:space="preserve">Choose TWO macromolecules from the list (carbohydrates, proteins, lipids) and explain in detail how each molecule's structure determines its function in the body. Your answer must include the monomers involved, how polymers are formed or broken down (including the type of chemical reaction), and at least one specific example of how a structural feature directly enables a biological function.</w:t>
             </w:r>
           </w:p>
         </w:tc>
@@ -714,83 +676,7 @@
                 <w:sz w:val="18"/>
                 <w:szCs w:val="18"/>
               </w:rPr>
-              <w:t xml:space="preserve">Each chemical of life performs specific and irreplaceable functions inside the body. Carbohydrates are the body's primary energy source. When a student eats ugali, the starch is digested into glucose, which enters the bloodstream at a controlled rate and is used in cellular respiration to release ATP — the energy currency of the cell. Because starch is a polysaccharide, its digestion is gradual, providing sustained energy over several hours. This explains why the student in our phenomenon felt energetic for a long time after her meal of ugali, sukuma wiki, and nyama choma.</w:t>
-            </w:r>
-          </w:p>
-          <w:p>
-            <w:pPr>
-              <w:spacing w:after="40" w:before="0"/>
-              <w:jc w:val="left"/>
-            </w:pPr>
-            <w:r>
-              <w:rPr>
-                <w:rFonts w:ascii="Arial" w:cs="Arial" w:eastAsia="Arial" w:hAnsi="Arial"/>
-                <w:b w:val="false"/>
-                <w:bCs w:val="false"/>
-                <w:i w:val="false"/>
-                <w:iCs w:val="false"/>
-                <w:color w:val="000000"/>
-                <w:sz w:val="18"/>
-                <w:szCs w:val="18"/>
-              </w:rPr>
-              <w:t xml:space="preserve"/>
-            </w:r>
-          </w:p>
-          <w:p>
-            <w:pPr>
-              <w:spacing w:after="40" w:before="0"/>
-              <w:jc w:val="left"/>
-            </w:pPr>
-            <w:r>
-              <w:rPr>
-                <w:rFonts w:ascii="Arial" w:cs="Arial" w:eastAsia="Arial" w:hAnsi="Arial"/>
-                <w:b w:val="false"/>
-                <w:bCs w:val="false"/>
-                <w:i w:val="false"/>
-                <w:iCs w:val="false"/>
-                <w:color w:val="000000"/>
-                <w:sz w:val="18"/>
-                <w:szCs w:val="18"/>
-              </w:rPr>
-              <w:t xml:space="preserve">Proteins from nyama choma and beans in githeri are digested into amino acids, which are then reassembled into new proteins for growth, tissue repair, enzyme production, and the making of hormones and antibodies. Without adequate protein, a student's muscles cannot be repaired after exercise and her immune system cannot function properly. Lipids, such as those in the fat on nyama choma or the oil used to fry mandazi, serve as a concentrated long-term energy store: one gram of fat stores more than twice the energy of one gram of carbohydrate. Lipids also insulate the body, form the phospholipid bilayer of every cell membrane, and are needed to absorb fat-soluble vitamins.</w:t>
-            </w:r>
-          </w:p>
-          <w:p>
-            <w:pPr>
-              <w:spacing w:after="40" w:before="0"/>
-              <w:jc w:val="left"/>
-            </w:pPr>
-            <w:r>
-              <w:rPr>
-                <w:rFonts w:ascii="Arial" w:cs="Arial" w:eastAsia="Arial" w:hAnsi="Arial"/>
-                <w:b w:val="false"/>
-                <w:bCs w:val="false"/>
-                <w:i w:val="false"/>
-                <w:iCs w:val="false"/>
-                <w:color w:val="000000"/>
-                <w:sz w:val="18"/>
-                <w:szCs w:val="18"/>
-              </w:rPr>
-              <w:t xml:space="preserve"/>
-            </w:r>
-          </w:p>
-          <w:p>
-            <w:pPr>
-              <w:spacing w:after="40" w:before="0"/>
-              <w:jc w:val="left"/>
-            </w:pPr>
-            <w:r>
-              <w:rPr>
-                <w:rFonts w:ascii="Arial" w:cs="Arial" w:eastAsia="Arial" w:hAnsi="Arial"/>
-                <w:b w:val="false"/>
-                <w:bCs w:val="false"/>
-                <w:i w:val="false"/>
-                <w:iCs w:val="false"/>
-                <w:color w:val="000000"/>
-                <w:sz w:val="18"/>
-                <w:szCs w:val="18"/>
-              </w:rPr>
-              <w:t xml:space="preserve">Water is essential as a solvent — all chemical reactions in the body, including digestion and cellular respiration, occur in aqueous solution. Water also transports dissolved nutrients and waste products in the blood. Mineral salts like calcium strengthen bones and teeth, while iron is a component of haemoglobin in red blood cells, enabling oxygen transport to muscles and organs. The mandazi-and-soda meal lacked adequate protein, complex carbohydrates, and mineral salts — it provided a rapid glucose spike from simple sugars but no sustained release, no amino acids for repair, and no minerals for body regulation. This is why the student felt a quick burst of energy followed by tiredness and hunger.</w:t>
+              <w:t xml:space="preserve">Proteins are constructed from amino acid monomers, of which there are twenty types, each differing in their R-group (side chain). Amino acids are joined together by peptide bonds formed through condensation reactions, in which a water molecule is released for each bond formed. The resulting polypeptide chain folds into a specific three-dimensional shape — determined by interactions between R-groups — that gives each protein its unique function. For example, enzymes such as amylase (found in saliva) have an active site whose precise shape allows only specific substrate molecules to bind; a change in that shape through denaturation destroys enzyme function entirely. Haemoglobin's quaternary structure, made of four folded polypeptide subunits, gives it the ability to carry four oxygen molecules simultaneously — a structural feature directly enabling efficient oxygen transport in the blood. When the brother in our phenomenon lacks dietary protein, his body cannot synthesise haemoglobin in adequate quantities, reducing oxygen delivery to tissues and contributing to fatigue and poor growth. Carbohydrates are built from monosaccharide monomers such as glucose (C₆H₁₂O₆). Two monosaccharides join via a glycosidic bond in a condensation reaction to form disaccharides (e.g., maltose, found as starch is digested), and many monosaccharides join to form polysaccharides. Starch, the storage carbohydrate in maize (the base of ugali), has a branched or unbranched helical structure that makes it compact for storage and easily accessible for hydrolysis by amylase enzymes. Cellulose, by contrast, has beta-glycosidic bonds that create straight, rigid chains — giving plant cell walls structural strength but making cellulose indigestible by humans. The structural difference between alpha-glucose (starch) and beta-glucose (cellulose) — a single difference in the orientation of the hydroxyl group on carbon-1 — results in radically different biological functions, illustrating that molecular geometry directly governs biological role.</w:t>
             </w:r>
           </w:p>
         </w:tc>
@@ -851,7 +737,7 @@
                 <w:sz w:val="22"/>
                 <w:szCs w:val="22"/>
               </w:rPr>
-              <w:t xml:space="preserve">SECTION 3: FOOD TEST EVIDENCE — DETECTING CHEMICALS IN KENYAN FOODS</w:t>
+              <w:t xml:space="preserve">SECTION 3: ENZYMES AND THE REGULATION OF CHEMICAL PROCESSES</w:t>
             </w:r>
           </w:p>
         </w:tc>
@@ -885,7 +771,7 @@
                 <w:sz w:val="18"/>
                 <w:szCs w:val="18"/>
               </w:rPr>
-              <w:t xml:space="preserve">Describe the food tests you conducted in Lesson 4 and explain what the results told you about the chemicals present in specific Kenyan foods. For each test, name the reagent used, describe the positive result (colour change), and state which food tested positive and why. Use your experimental evidence to link chemical identity to food function. Explain what a false result or negative result would look like and why it matters to use a control.</w:t>
+              <w:t xml:space="preserve">Explain how enzymes regulate chemical processes in living organisms. Your answer must cover enzyme structure, the mechanism by which enzymes catalyse reactions (including the lock-and-key or induced-fit model), and how factors such as temperature, pH, and substrate concentration affect enzyme activity. Connect your explanation to the process of digestion in the human gut, using at least one specific enzyme involved in breaking down food eaten in Kenya.</w:t>
             </w:r>
           </w:p>
         </w:tc>
@@ -917,83 +803,7 @@
                 <w:sz w:val="18"/>
                 <w:szCs w:val="18"/>
               </w:rPr>
-              <w:t xml:space="preserve">In Lesson 4, we conducted a series of food tests to detect the presence of specific chemicals of life in Kenyan food samples, including maize flour (ugali), cooked beans, sukuma wiki extract, cooking oil, and glucose solution. These tests provided direct experimental evidence for the chemicals identified on food labels.</w:t>
-            </w:r>
-          </w:p>
-          <w:p>
-            <w:pPr>
-              <w:spacing w:after="40" w:before="0"/>
-              <w:jc w:val="left"/>
-            </w:pPr>
-            <w:r>
-              <w:rPr>
-                <w:rFonts w:ascii="Arial" w:cs="Arial" w:eastAsia="Arial" w:hAnsi="Arial"/>
-                <w:b w:val="false"/>
-                <w:bCs w:val="false"/>
-                <w:i w:val="false"/>
-                <w:iCs w:val="false"/>
-                <w:color w:val="000000"/>
-                <w:sz w:val="18"/>
-                <w:szCs w:val="18"/>
-              </w:rPr>
-              <w:t xml:space="preserve"/>
-            </w:r>
-          </w:p>
-          <w:p>
-            <w:pPr>
-              <w:spacing w:after="40" w:before="0"/>
-              <w:jc w:val="left"/>
-            </w:pPr>
-            <w:r>
-              <w:rPr>
-                <w:rFonts w:ascii="Arial" w:cs="Arial" w:eastAsia="Arial" w:hAnsi="Arial"/>
-                <w:b w:val="false"/>
-                <w:bCs w:val="false"/>
-                <w:i w:val="false"/>
-                <w:iCs w:val="false"/>
-                <w:color w:val="000000"/>
-                <w:sz w:val="18"/>
-                <w:szCs w:val="18"/>
-              </w:rPr>
-              <w:t xml:space="preserve">For starch, we used iodine solution (Lugol's iodine). When we added iodine to the maize flour sample, it turned from orange-brown to blue-black, confirming the presence of starch — a complex polysaccharide. The glucose solution remained orange-brown (negative result), confirming it contained no starch. For reducing sugars, we used Benedict's reagent. After heating the glucose solution with Benedict's reagent in a water bath, the solution changed from blue to brick-red, indicating the presence of a reducing sugar (glucose). The maize flour sample gave only a light green colour, showing little to no free reducing sugar — consistent with its starch content rather than free glucose. This directly explains the phenomenon: glucose biscuits contain free sugars that are absorbed rapidly, while ugali starch must be digested first.</w:t>
-            </w:r>
-          </w:p>
-          <w:p>
-            <w:pPr>
-              <w:spacing w:after="40" w:before="0"/>
-              <w:jc w:val="left"/>
-            </w:pPr>
-            <w:r>
-              <w:rPr>
-                <w:rFonts w:ascii="Arial" w:cs="Arial" w:eastAsia="Arial" w:hAnsi="Arial"/>
-                <w:b w:val="false"/>
-                <w:bCs w:val="false"/>
-                <w:i w:val="false"/>
-                <w:iCs w:val="false"/>
-                <w:color w:val="000000"/>
-                <w:sz w:val="18"/>
-                <w:szCs w:val="18"/>
-              </w:rPr>
-              <w:t xml:space="preserve"/>
-            </w:r>
-          </w:p>
-          <w:p>
-            <w:pPr>
-              <w:spacing w:after="40" w:before="0"/>
-              <w:jc w:val="left"/>
-            </w:pPr>
-            <w:r>
-              <w:rPr>
-                <w:rFonts w:ascii="Arial" w:cs="Arial" w:eastAsia="Arial" w:hAnsi="Arial"/>
-                <w:b w:val="false"/>
-                <w:bCs w:val="false"/>
-                <w:i w:val="false"/>
-                <w:iCs w:val="false"/>
-                <w:color w:val="000000"/>
-                <w:sz w:val="18"/>
-                <w:szCs w:val="18"/>
-              </w:rPr>
-              <w:t xml:space="preserve">For proteins, we used the Biuret test: adding sodium hydroxide followed by copper sulfate solution to the beans extract produced a purple/violet colour, confirming proteins were present. Cooking oil tested with Sudan III stain turned red, confirming the presence of lipids. The control tubes — containing only water — showed no colour change in any test, confirming that our positive results were due to the food chemicals and not the reagents themselves. Using a control is essential in science: without it, we cannot distinguish a true positive result from a false one caused by a contaminated reagent. These experimental results gave us real evidence — not just labels — that the chemicals of life are genuinely present in the Kenyan foods we eat every day.</w:t>
+              <w:t xml:space="preserve">Enzymes are biological catalysts — almost always globular proteins — that speed up chemical reactions in living organisms without being consumed in the process. Each enzyme has a region called the active site, a three-dimensional pocket whose shape is complementary to a specific substrate molecule. According to the lock-and-key model, the substrate fits precisely into the active site the way a key fits a lock, forming an enzyme-substrate complex. In the more nuanced induced-fit model, the active site changes shape slightly as the substrate binds, creating a tighter, more effective fit. Once bound, the enzyme lowers the activation energy needed for the reaction to proceed, allowing products to form rapidly. The enzyme is then released unchanged and is free to catalyse another reaction cycle. Enzyme activity is sensitive to environmental conditions. Temperature increases the kinetic energy of molecules, raising the rate of enzyme-substrate collisions and increasing reaction rate — up to an optimum, typically around 37°C in the human body. Above this temperature, the enzyme denatures: heat breaks the hydrogen bonds and other interactions that maintain its three-dimensional shape, distorting the active site so that substrate can no longer bind. pH also affects enzyme shape; each enzyme has an optimum pH. Pepsin, which digests proteins in the stomach, works best at a highly acidic pH of around 2, while pancreatic amylase works best at the neutral to slightly alkaline pH of the small intestine. When a Kenyan student eats githeri — a mixture of maize and beans — salivary amylase in the mouth begins hydrolysing the starch in maize into maltose by breaking glycosidic bonds (hydrolysis reactions, which are the reverse of condensation). In the small intestine, proteases such as trypsin break the peptide bonds of bean proteins into amino acids that can be absorbed into the bloodstream. These amino acids then travel to cells throughout the body and are assembled into the proteins the growing child needs. The brother who eats mainly ugali provides amylase with ample substrate (starch) but gives protease enzymes very little protein substrate to work with, meaning his body cannot absorb the amino acids needed for growth, immune function, and tissue repair.</w:t>
             </w:r>
           </w:p>
         </w:tc>
@@ -1054,7 +864,7 @@
                 <w:sz w:val="22"/>
                 <w:szCs w:val="22"/>
               </w:rPr>
-              <w:t xml:space="preserve">SECTION 4: ENZYMES — HOW STRUCTURE DETERMINES DIGESTION</w:t>
+              <w:t xml:space="preserve">SECTION 4: DEFICIENCY, DISEASE, AND THE MOLECULAR EXPLANATION</w:t>
             </w:r>
           </w:p>
         </w:tc>
@@ -1088,7 +898,7 @@
                 <w:sz w:val="18"/>
                 <w:szCs w:val="18"/>
               </w:rPr>
-              <w:t xml:space="preserve">Explain what enzymes are, how they work (including the lock-and-key model and the concept of the active site), and describe at least three factors that affect enzyme activity. Use examples of digestive enzymes that act on carbohydrates, proteins, and lipids. Connect enzyme activity to the phenomenon by explaining why the speed at which food is digested — controlled by enzymes — determines how quickly energy is released and how long satiety lasts.</w:t>
+              <w:t xml:space="preserve">Using specific biological evidence, explain what happens at the molecular and cellular level when a person's diet is deficient in protein. Name and describe at least ONE protein-deficiency condition relevant to Kenya. Then explain how the varied diet of the neighbour's child prevents such conditions. Finally, suggest two practical, locally realistic dietary recommendations — based on molecular evidence — that the brother's family could adopt to improve his health.</w:t>
             </w:r>
           </w:p>
         </w:tc>
@@ -1120,83 +930,7 @@
                 <w:sz w:val="18"/>
                 <w:szCs w:val="18"/>
               </w:rPr>
-              <w:t xml:space="preserve">Enzymes are biological catalysts — they are proteins that speed up chemical reactions in the body without being used up themselves. Every enzyme has a specific three-dimensional shape at its active site that matches only certain substrate molecules, just as a specific key fits only one lock. This is called the lock-and-key model. When the substrate binds to the active site, an enzyme-substrate complex forms, the reaction proceeds rapidly, and the products are released — leaving the enzyme free to catalyse the next reaction.</w:t>
-            </w:r>
-          </w:p>
-          <w:p>
-            <w:pPr>
-              <w:spacing w:after="40" w:before="0"/>
-              <w:jc w:val="left"/>
-            </w:pPr>
-            <w:r>
-              <w:rPr>
-                <w:rFonts w:ascii="Arial" w:cs="Arial" w:eastAsia="Arial" w:hAnsi="Arial"/>
-                <w:b w:val="false"/>
-                <w:bCs w:val="false"/>
-                <w:i w:val="false"/>
-                <w:iCs w:val="false"/>
-                <w:color w:val="000000"/>
-                <w:sz w:val="18"/>
-                <w:szCs w:val="18"/>
-              </w:rPr>
-              <w:t xml:space="preserve"/>
-            </w:r>
-          </w:p>
-          <w:p>
-            <w:pPr>
-              <w:spacing w:after="40" w:before="0"/>
-              <w:jc w:val="left"/>
-            </w:pPr>
-            <w:r>
-              <w:rPr>
-                <w:rFonts w:ascii="Arial" w:cs="Arial" w:eastAsia="Arial" w:hAnsi="Arial"/>
-                <w:b w:val="false"/>
-                <w:bCs w:val="false"/>
-                <w:i w:val="false"/>
-                <w:iCs w:val="false"/>
-                <w:color w:val="000000"/>
-                <w:sz w:val="18"/>
-                <w:szCs w:val="18"/>
-              </w:rPr>
-              <w:t xml:space="preserve">Digestive enzymes break down the large macromolecules in food into their monomers so they can be absorbed. Amylase (produced in the salivary glands and pancreas) breaks starch into maltose; maltase then breaks maltose into glucose. Protease enzymes like pepsin (in the stomach) and trypsin (in the small intestine) break proteins into amino acids. Lipase enzymes in the small intestine break lipids into glycerol and fatty acids. The specificity of each enzyme — its precise active site shape — means each one acts only on its specific substrate.</w:t>
-            </w:r>
-          </w:p>
-          <w:p>
-            <w:pPr>
-              <w:spacing w:after="40" w:before="0"/>
-              <w:jc w:val="left"/>
-            </w:pPr>
-            <w:r>
-              <w:rPr>
-                <w:rFonts w:ascii="Arial" w:cs="Arial" w:eastAsia="Arial" w:hAnsi="Arial"/>
-                <w:b w:val="false"/>
-                <w:bCs w:val="false"/>
-                <w:i w:val="false"/>
-                <w:iCs w:val="false"/>
-                <w:color w:val="000000"/>
-                <w:sz w:val="18"/>
-                <w:szCs w:val="18"/>
-              </w:rPr>
-              <w:t xml:space="preserve"/>
-            </w:r>
-          </w:p>
-          <w:p>
-            <w:pPr>
-              <w:spacing w:after="40" w:before="0"/>
-              <w:jc w:val="left"/>
-            </w:pPr>
-            <w:r>
-              <w:rPr>
-                <w:rFonts w:ascii="Arial" w:cs="Arial" w:eastAsia="Arial" w:hAnsi="Arial"/>
-                <w:b w:val="false"/>
-                <w:bCs w:val="false"/>
-                <w:i w:val="false"/>
-                <w:iCs w:val="false"/>
-                <w:color w:val="000000"/>
-                <w:sz w:val="18"/>
-                <w:szCs w:val="18"/>
-              </w:rPr>
-              <w:t xml:space="preserve">Three key factors affect enzyme activity: temperature, pH, and substrate concentration. In Lesson 5, we investigated how temperature affects amylase activity on starch. At temperatures close to body temperature (37°C), the enzyme worked fastest — the active site and substrate had optimal kinetic energy for binding. At very high temperatures (above 60°C), the enzyme was denatured: the heat broke the bonds holding the protein's shape, permanently distorting the active site so it could no longer bind to starch. At very low temperatures, the enzyme slowed down because molecules had less kinetic energy. Similarly, each enzyme has an optimal pH: pepsin works best at the acidic pH of the stomach (~pH 2), while amylase works best at neutral to slightly alkaline pH. These factors explain why food digestion is precisely regulated in different parts of the digestive tract. Returning to the phenomenon: the starch in ugali is digested gradually by amylase along the digestive tract, releasing glucose slowly — giving sustained energy. The simple sugars in mandazi and soda require almost no enzyme digestion and are absorbed almost immediately, causing a rapid glucose spike followed by a crash.</w:t>
+              <w:t xml:space="preserve">When dietary protein intake is chronically insufficient, the body cannot synthesise the full range of proteins it requires. At the molecular level, ribosomes lack the amino acid monomers needed to complete polypeptide chains, so protein synthesis slows or halts. The body responds by breaking down its own muscle proteins to release amino acids for more critical functions such as enzyme production and immune defence — a process called catabolism. Over time, this leads to muscle wasting (atrophy), reduced production of antibodies, impaired growth hormone signalling, and a decrease in plasma proteins such as albumin. When albumin levels in the blood fall, osmotic pressure in blood vessels drops, causing fluid to leak into surrounding tissues and produce the characteristic swelling (oedema) seen in severe protein malnutrition. This condition, known as Kwashiorkor, is observed in parts of Kenya, particularly in regions where maize or cassava forms the almost exclusive diet without adequate legume, dairy, or animal protein supplementation. Children with Kwashiorkor show oedema (especially a swollen abdomen), stunted growth, depigmented hair, and severe susceptibility to infections because their immune systems cannot produce adequate antibodies. The neighbour's child's diet — githeri (maize and beans together, which provide complementary amino acids), sukuma wiki (providing vitamins and minerals that support enzyme cofactor function), and milk (a complete protein source) — ensures a continuous supply of all essential amino acids, enabling full protein synthesis, robust antibody production, adequate muscle development, and efficient tissue repair. For the brother's family, two realistic and affordable recommendations are: first, to add beans, lentils, or green grams (ndengu) to every ugali meal, since legumes are affordable and rich in essential amino acids that complement the incomplete proteins in maize; second, to incorporate eggs or omena (dried sardines from Lake Victoria) into the weekly diet, as these are inexpensive, locally available, and high-quality complete protein sources that supply all essential amino acids needed for normal growth and immune function.</w:t>
             </w:r>
           </w:p>
         </w:tc>
@@ -1257,7 +991,7 @@
                 <w:sz w:val="22"/>
                 <w:szCs w:val="22"/>
               </w:rPr>
-              <w:t xml:space="preserve">SECTION 5: RETURNING TO THE PHENOMENON — SOLVING THE MYSTERY</w:t>
+              <w:t xml:space="preserve">SECTION 5: SYNTHESISING YOUR UNDERSTANDING — RETURNING TO THE PHENOMENON</w:t>
             </w:r>
           </w:p>
         </w:tc>
@@ -1291,7 +1025,7 @@
                 <w:sz w:val="18"/>
                 <w:szCs w:val="18"/>
               </w:rPr>
-              <w:t xml:space="preserve">Now bring everything together to fully explain the original phenomenon. Why did ugali, sukuma wiki, and nyama choma sustain the student for hours, while mandazi and soda left her tired and hungry? Use your knowledge of molecular structure, chemical functions, enzyme digestion, and energy release to construct a complete scientific explanation. Refer to concepts from at least three lessons in your answer and explain what you now understand that you did not know at the start of Lesson 1.</w:t>
+              <w:t xml:space="preserve">Return to the original anchoring phenomenon. Write a complete and cohesive scientific explanation — as if you were explaining to a doctor or a nutritionist — of why the two children, both eating until they feel full, show such different outcomes in growth, immunity, and energy. Your explanation must integrate knowledge of macromolecule structure and function, enzyme action, and the molecular consequences of dietary deficiency. Conclude by reflecting on what this phenomenon reveals about the relationship between molecular biology and human health in Kenya.</w:t>
             </w:r>
           </w:p>
         </w:tc>
@@ -1323,121 +1057,7 @@
                 <w:sz w:val="18"/>
                 <w:szCs w:val="18"/>
               </w:rPr>
-              <w:t xml:space="preserve">At the start of this sub-strand, the student's observation was puzzling: all the foods she ate provided energy, yet they behaved very differently in her body. We can now explain this fully using the science of the chemicals of life.</w:t>
-            </w:r>
-          </w:p>
-          <w:p>
-            <w:pPr>
-              <w:spacing w:after="40" w:before="0"/>
-              <w:jc w:val="left"/>
-            </w:pPr>
-            <w:r>
-              <w:rPr>
-                <w:rFonts w:ascii="Arial" w:cs="Arial" w:eastAsia="Arial" w:hAnsi="Arial"/>
-                <w:b w:val="false"/>
-                <w:bCs w:val="false"/>
-                <w:i w:val="false"/>
-                <w:iCs w:val="false"/>
-                <w:color w:val="000000"/>
-                <w:sz w:val="18"/>
-                <w:szCs w:val="18"/>
-              </w:rPr>
-              <w:t xml:space="preserve"/>
-            </w:r>
-          </w:p>
-          <w:p>
-            <w:pPr>
-              <w:spacing w:after="40" w:before="0"/>
-              <w:jc w:val="left"/>
-            </w:pPr>
-            <w:r>
-              <w:rPr>
-                <w:rFonts w:ascii="Arial" w:cs="Arial" w:eastAsia="Arial" w:hAnsi="Arial"/>
-                <w:b w:val="false"/>
-                <w:bCs w:val="false"/>
-                <w:i w:val="false"/>
-                <w:iCs w:val="false"/>
-                <w:color w:val="000000"/>
-                <w:sz w:val="18"/>
-                <w:szCs w:val="18"/>
-              </w:rPr>
-              <w:t xml:space="preserve">The balanced meal of ugali, sukuma wiki, and nyama choma contained a carefully structured mix of macromolecules. The ugali provided starch — a complex polysaccharide made of hundreds of glucose units — which could only be broken down gradually by amylase enzymes over time, releasing glucose slowly and steadily into the bloodstream. This slow release means blood glucose stays at a moderate, sustained level for hours, providing a long-lasting energy supply for cellular respiration. The nyama choma provided protein — amino acids needed not for immediate energy but for muscle repair, enzyme production, and immune function. The sukuma wiki provided mineral salts including iron (for haemoglobin) and calcium, as well as water and dietary fibre that slowed digestion further, extending the release of nutrients. Together, this meal met multiple biological needs simultaneously.</w:t>
-            </w:r>
-          </w:p>
-          <w:p>
-            <w:pPr>
-              <w:spacing w:after="40" w:before="0"/>
-              <w:jc w:val="left"/>
-            </w:pPr>
-            <w:r>
-              <w:rPr>
-                <w:rFonts w:ascii="Arial" w:cs="Arial" w:eastAsia="Arial" w:hAnsi="Arial"/>
-                <w:b w:val="false"/>
-                <w:bCs w:val="false"/>
-                <w:i w:val="false"/>
-                <w:iCs w:val="false"/>
-                <w:color w:val="000000"/>
-                <w:sz w:val="18"/>
-                <w:szCs w:val="18"/>
-              </w:rPr>
-              <w:t xml:space="preserve"/>
-            </w:r>
-          </w:p>
-          <w:p>
-            <w:pPr>
-              <w:spacing w:after="40" w:before="0"/>
-              <w:jc w:val="left"/>
-            </w:pPr>
-            <w:r>
-              <w:rPr>
-                <w:rFonts w:ascii="Arial" w:cs="Arial" w:eastAsia="Arial" w:hAnsi="Arial"/>
-                <w:b w:val="false"/>
-                <w:bCs w:val="false"/>
-                <w:i w:val="false"/>
-                <w:iCs w:val="false"/>
-                <w:color w:val="000000"/>
-                <w:sz w:val="18"/>
-                <w:szCs w:val="18"/>
-              </w:rPr>
-              <w:t xml:space="preserve">The mandazi and soda, by contrast, contained almost entirely simple sugars (monosaccharides and disaccharides). These required minimal enzyme digestion — they were absorbed directly and rapidly into the bloodstream, causing a sharp spike in blood glucose. The body responded by secreting insulin to reduce blood glucose rapidly, leading to a sudden drop — which the student felt as tiredness and hunger. The mandazi also lacked adequate protein, mineral salts, and complex carbohydrates, meaning none of the body's longer-term nutritional needs were met.</w:t>
-            </w:r>
-          </w:p>
-          <w:p>
-            <w:pPr>
-              <w:spacing w:after="40" w:before="0"/>
-              <w:jc w:val="left"/>
-            </w:pPr>
-            <w:r>
-              <w:rPr>
-                <w:rFonts w:ascii="Arial" w:cs="Arial" w:eastAsia="Arial" w:hAnsi="Arial"/>
-                <w:b w:val="false"/>
-                <w:bCs w:val="false"/>
-                <w:i w:val="false"/>
-                <w:iCs w:val="false"/>
-                <w:color w:val="000000"/>
-                <w:sz w:val="18"/>
-                <w:szCs w:val="18"/>
-              </w:rPr>
-              <w:t xml:space="preserve"/>
-            </w:r>
-          </w:p>
-          <w:p>
-            <w:pPr>
-              <w:spacing w:after="40" w:before="0"/>
-              <w:jc w:val="left"/>
-            </w:pPr>
-            <w:r>
-              <w:rPr>
-                <w:rFonts w:ascii="Arial" w:cs="Arial" w:eastAsia="Arial" w:hAnsi="Arial"/>
-                <w:b w:val="false"/>
-                <w:bCs w:val="false"/>
-                <w:i w:val="false"/>
-                <w:iCs w:val="false"/>
-                <w:color w:val="000000"/>
-                <w:sz w:val="18"/>
-                <w:szCs w:val="18"/>
-              </w:rPr>
-              <w:t xml:space="preserve">This mystery is now solved: it is not just the total energy content of food that matters, but the specific types of molecules present, their molecular structures, the enzymes needed to digest them, and the rate at which they release energy. A food label listing complex carbohydrates, proteins, lipids, iron, and calcium — like uji flour — describes a food that meets the body's full range of chemical needs. A label listing mostly sugars — like glucose biscuits — describes a food that meets only the most immediate and short-lived energy demand. Structure determines function: this is the central principle of the chemicals of life, and it explains everything we observed in this sub-strand.</w:t>
+              <w:t xml:space="preserve">The observation that two children can both feel full yet develop so differently is explained entirely at the molecular level. Feeling full is a sensation triggered largely by stomach distension and caloric intake — it tells the body that food volume and energy supply are sufficient, but it reveals nothing about the chemical composition of what has been eaten. The brother's diet of plain ugali provides glucose polymers (starch) that are hydrolysed by amylase and absorbed as glucose, fuelling cellular respiration and ATP production. He is not starving for energy in the short term. However, his diet is critically deficient in protein, essential fatty acids, and micronutrients. Without a continuous supply of diverse amino acids, his ribosomes cannot synthesise the full complement of structural proteins (actin and myosin for muscle, collagen for connective tissue), regulatory proteins (growth hormone, insulin), transport proteins (haemoglobin), or immune proteins (antibodies and complement proteins). The consequences cascade through every organ system: his muscles remain underdeveloped because there are insufficient amino acids for myofibril synthesis; his immune system is compromised because B-lymphocytes cannot produce adequate immunoglobulins; his recovery from illness is prolonged because the enzymes and cells needed for tissue repair cannot be manufactured in sufficient quantities. The neighbour's child, eating githeri, sukuma wiki, milk, and nyama choma, supplies her body with all twenty amino acids (including all nine essential ones), complex carbohydrates for sustained energy, lipids for membrane integrity and nerve insulation, iron for haemoglobin, calcium for bone mineralisation, and vitamins that serve as enzyme cofactors. Her enzyme systems — digestive proteases, metabolic kinases, antioxidant enzymes — all function at optimal rates because both the enzyme proteins themselves and their cofactors are available. This phenomenon powerfully illustrates that human health is fundamentally a molecular phenomenon. What we see on the outside — growth, strength, energy, resistance to disease — is the visible expression of trillions of molecular interactions happening inside every cell. In the Kenyan context, where maize-based diets dominate in many households and protein-rich foods may be perceived as expensive, this understanding has profound public health implications. Educating families about protein complementarity (combining maize with beans or lentils), the nutritional value of affordable local foods like omena and eggs, and the molecular basis of nutrition can transform health outcomes for children across Kenya without requiring expensive dietary changes.</w:t>
             </w:r>
           </w:p>
         </w:tc>
@@ -1664,7 +1284,7 @@
                 <w:sz w:val="18"/>
                 <w:szCs w:val="18"/>
               </w:rPr>
-              <w:t xml:space="preserve">Knowledge of Chemicals of Life — Identity, Structure, and Sources</w:t>
+              <w:t xml:space="preserve">Scientific Accuracy and Use of Biological Vocabulary</w:t>
             </w:r>
           </w:p>
         </w:tc>
@@ -1696,7 +1316,7 @@
                 <w:sz w:val="18"/>
                 <w:szCs w:val="18"/>
               </w:rPr>
-              <w:t xml:space="preserve">Accurately identifies all five chemicals of life (carbohydrates, proteins, lipids, water, mineral salts), correctly describes monomers/building blocks for macromolecules (e.g., glucose → starch, amino acids → proteins, glycerol + fatty acids → lipids), and names specific Kenyan food sources for each. Clearly distinguishes simple from complex carbohydrates using the phenomenon food labels as evidence.</w:t>
+              <w:t xml:space="preserve">All scientific content is accurate and complete. Student consistently and correctly uses key vocabulary (e.g., monomer, polymer, peptide bond, condensation, hydrolysis, active site, denaturation, amino acid, macromolecule) in context. Explanations reflect a secure understanding of molecular mechanisms with no factual errors.</w:t>
             </w:r>
           </w:p>
         </w:tc>
@@ -1728,7 +1348,7 @@
                 <w:sz w:val="18"/>
                 <w:szCs w:val="18"/>
               </w:rPr>
-              <w:t xml:space="preserve">Correctly identifies at least four chemicals of life and provides accurate building block information for at least two macromolecules. Includes at least two Kenyan food examples. Distinguishes simple from complex carbohydrates but may not fully link this to the food labels in the phenomenon.</w:t>
+              <w:t xml:space="preserve">Most scientific content is accurate. Key vocabulary is used correctly in most cases, with minor errors or omissions that do not obscure understanding. Core molecular mechanisms are described correctly, though some detail may be missing.</w:t>
             </w:r>
           </w:p>
         </w:tc>
@@ -1760,7 +1380,7 @@
                 <w:sz w:val="18"/>
                 <w:szCs w:val="18"/>
               </w:rPr>
-              <w:t xml:space="preserve">Identifies two or fewer chemicals of life with limited or inaccurate descriptions of structure. Few or no Kenyan food examples provided. Little or no distinction made between simple and complex carbohydrates, or significant factual errors are present.</w:t>
+              <w:t xml:space="preserve">Scientific content contains significant errors or misconceptions. Vocabulary is misused, missing, or used without understanding. Explanations remain at a surface level (e.g., 'proteins make you strong') without describing underlying molecular mechanisms.</w:t>
             </w:r>
           </w:p>
         </w:tc>
@@ -1794,7 +1414,7 @@
                 <w:sz w:val="18"/>
                 <w:szCs w:val="18"/>
               </w:rPr>
-              <w:t xml:space="preserve">Understanding of Biological Functions of Chemicals of Life</w:t>
+              <w:t xml:space="preserve">Explanation of Enzyme Structure and Function</w:t>
             </w:r>
           </w:p>
         </w:tc>
@@ -1826,7 +1446,7 @@
                 <w:sz w:val="18"/>
                 <w:szCs w:val="18"/>
               </w:rPr>
-              <w:t xml:space="preserve">Accurately and specifically explains the function of each chemical of life in the body (energy supply, growth and repair, long-term storage, solvent/transport, structural/regulatory roles). Clearly connects each function to the phenomenon, explaining why the balanced meal sustained energy longer than the simple-sugar meal. Uses precise biological vocabulary (e.g., cellular respiration, ATP, haemoglobin, cell membrane).</w:t>
+              <w:t xml:space="preserve">Student provides a detailed, accurate explanation of enzyme structure (active site, specificity, globular protein), mechanism (lock-and-key or induced-fit, enzyme-substrate complex, activation energy), and the effect of at least two factors (temperature, pH, substrate concentration) on enzyme activity. Explanation is clearly connected to digestion with a specific named Kenyan food enzyme example.</w:t>
             </w:r>
           </w:p>
         </w:tc>
@@ -1858,7 +1478,7 @@
                 <w:sz w:val="18"/>
                 <w:szCs w:val="18"/>
               </w:rPr>
-              <w:t xml:space="preserve">Correctly explains functions for at least three chemicals of life with some connection to the phenomenon. Uses mostly accurate biological vocabulary. May describe functions in general terms without full precision (e.g., 'proteins help the body grow' without mentioning amino acids or specific roles like enzyme production).</w:t>
+              <w:t xml:space="preserve">Student explains enzyme function and at least one factor affecting activity correctly. The connection to digestion is present but may lack specificity or a clear Kenyan food context. Minor gaps in mechanistic detail do not significantly impair the explanation.</w:t>
             </w:r>
           </w:p>
         </w:tc>
@@ -1890,7 +1510,7 @@
                 <w:sz w:val="18"/>
                 <w:szCs w:val="18"/>
               </w:rPr>
-              <w:t xml:space="preserve">Provides vague or incomplete descriptions of function for fewer than three chemicals. Little or no connection to the phenomenon. Biological vocabulary is missing or used incorrectly. Significant misconceptions may be present (e.g., stating that lipids and proteins are broken down first for energy).</w:t>
+              <w:t xml:space="preserve">Student shows a basic or incomplete understanding of enzymes (e.g., 'enzymes help break down food') without explaining the active site, specificity, or the effect of environmental factors. Kenyan food context is absent or incorrectly applied.</w:t>
             </w:r>
           </w:p>
         </w:tc>
@@ -1924,7 +1544,7 @@
                 <w:sz w:val="18"/>
                 <w:szCs w:val="18"/>
               </w:rPr>
-              <w:t xml:space="preserve">Experimental Evidence from Food Tests</w:t>
+              <w:t xml:space="preserve">Integration of Evidence and Connection to Phenomenon</w:t>
             </w:r>
           </w:p>
         </w:tc>
@@ -1956,7 +1576,7 @@
                 <w:sz w:val="18"/>
                 <w:szCs w:val="18"/>
               </w:rPr>
-              <w:t xml:space="preserve">Accurately describes at least four food tests (iodine/starch, Benedict's/reducing sugars, Biuret/proteins, Sudan III/lipids), correctly states the reagent, the positive colour change, and the specific Kenyan food that tested positive. Explains the purpose and interpretation of the control. Links food test results directly to the chemicals on food labels and to the phenomenon.</w:t>
+              <w:t xml:space="preserve">Student explicitly and consistently returns to the anchoring phenomenon throughout all sections, using it as an explanatory anchor. Evidence from at least three lessons (e.g., macromolecule structure, enzyme action, deficiency conditions) is woven together into a coherent, multi-causal explanation of why the two children differ. Explanations are causally linked (A leads to B because of C) rather than merely listed.</w:t>
             </w:r>
           </w:p>
         </w:tc>
@@ -1988,7 +1608,7 @@
                 <w:sz w:val="18"/>
                 <w:szCs w:val="18"/>
               </w:rPr>
-              <w:t xml:space="preserve">Accurately describes at least three food tests with correct reagent names and positive results. Mentions the control but may not fully explain its purpose. Some connection to the phenomenon or food labels is made but may be incomplete.</w:t>
+              <w:t xml:space="preserve">Student refers to the anchoring phenomenon in most sections and connects evidence from at least two lesson topics. Causal links are present but may be incomplete or not always clearly articulated. The overall explanation is coherent, though some sections may read as isolated facts rather than integrated reasoning.</w:t>
             </w:r>
           </w:p>
         </w:tc>
@@ -2020,7 +1640,7 @@
                 <w:sz w:val="18"/>
                 <w:szCs w:val="18"/>
               </w:rPr>
-              <w:t xml:space="preserve">Describes fewer than three food tests, or makes significant errors in reagents, colour changes, or interpretation. Little or no mention of controls. No clear link between experimental evidence and the phenomenon or food labels.</w:t>
+              <w:t xml:space="preserve">Student makes little or no reference to the anchoring phenomenon. Evidence from lessons is presented as disconnected facts without causal integration. The student does not explain why the two children differ in terms of molecular mechanisms.</w:t>
             </w:r>
           </w:p>
         </w:tc>
@@ -2054,7 +1674,7 @@
                 <w:sz w:val="18"/>
                 <w:szCs w:val="18"/>
               </w:rPr>
-              <w:t xml:space="preserve">Enzyme Structure, Function, and Factors Affecting Activity</w:t>
+              <w:t xml:space="preserve">Use of Kenyan Context and Real-World Application</w:t>
             </w:r>
           </w:p>
         </w:tc>
@@ -2086,7 +1706,7 @@
                 <w:sz w:val="18"/>
                 <w:szCs w:val="18"/>
               </w:rPr>
-              <w:t xml:space="preserve">Clearly explains the lock-and-key model including active site specificity and enzyme-substrate complex. Names at least two digestive enzymes with their correct substrates and products (e.g., amylase breaks starch into maltose; protease breaks proteins into amino acids). Accurately describes the effect of at least three factors (temperature, pH, substrate concentration) on enzyme activity, including denaturation. Connects enzyme digestion rate to the phenomenon (slow starch digestion vs. rapid sugar absorption).</w:t>
+              <w:t xml:space="preserve">Student consistently uses specific, accurate Kenyan examples throughout (e.g., named foods such as omena, githeri, sukuma wiki, ugali, ndengu; local health conditions such as Kwashiorkor in Kenya; affordable local dietary recommendations). Real-world application is scientifically grounded and practically relevant to a Kenyan community context.</w:t>
             </w:r>
           </w:p>
         </w:tc>
@@ -2118,7 +1738,7 @@
                 <w:sz w:val="18"/>
                 <w:szCs w:val="18"/>
               </w:rPr>
-              <w:t xml:space="preserve">Correctly explains the lock-and-key model with reference to the active site. Names at least one digestive enzyme with correct substrate and product. Accurately describes the effect of at least two factors on enzyme activity with some reference to denaturation. Makes some connection to enzyme activity and the digestion of foods in the phenomenon.</w:t>
+              <w:t xml:space="preserve">Student uses Kenyan examples in most sections with reasonable accuracy. At least one real-world application or dietary recommendation is offered. Examples are relevant, though some may lack specificity or local grounding.</w:t>
             </w:r>
           </w:p>
         </w:tc>
@@ -2150,7 +1770,7 @@
                 <w:sz w:val="18"/>
                 <w:szCs w:val="18"/>
               </w:rPr>
-              <w:t xml:space="preserve">Shows limited or inaccurate understanding of enzyme action (e.g., does not mention the active site or describes enzymes as being consumed in the reaction). Names fewer than one enzyme correctly. Describes fewer than two factors affecting enzyme activity, or descriptions contain significant errors. Little or no connection to the phenomenon.</w:t>
+              <w:t xml:space="preserve">Student uses few or no Kenyan examples, or examples are generic and could apply to any context. Real-world application is absent or superficial. Dietary recommendations, if present, are vague or not connected to molecular evidence.</w:t>
             </w:r>
           </w:p>
         </w:tc>
@@ -2184,7 +1804,7 @@
                 <w:sz w:val="18"/>
                 <w:szCs w:val="18"/>
               </w:rPr>
-              <w:t xml:space="preserve">Synthesis — Explaining the Phenomenon Using Evidence from Multiple Lessons</w:t>
+              <w:t xml:space="preserve">Quality of Scientific Reasoning and Written Communication</w:t>
             </w:r>
           </w:p>
         </w:tc>
@@ -2216,7 +1836,7 @@
                 <w:sz w:val="18"/>
                 <w:szCs w:val="18"/>
               </w:rPr>
-              <w:t xml:space="preserve">Constructs a full, coherent, and evidence-based explanation of the phenomenon that integrates knowledge from at least four lessons (molecular structure, chemical functions, food tests, enzyme action, and/or energy requirements). Clearly articulates the central principle that molecular structure determines biological function. Writing is well-organised, uses precise scientific vocabulary throughout, and meets the minimum 300-word requirement with no significant factual errors.</w:t>
+              <w:t xml:space="preserve">Student constructs clear, logical, multi-step scientific arguments throughout. Writing is well-organised, with ideas flowing coherently from evidence to explanation to conclusion. Answers are appropriately detailed and thorough. The student demonstrates the ability to synthesise across lessons rather than simply recalling individual facts. Writing is free from major grammatical errors that impede comprehension.</w:t>
             </w:r>
           </w:p>
         </w:tc>
@@ -2248,7 +1868,7 @@
                 <w:sz w:val="18"/>
                 <w:szCs w:val="18"/>
               </w:rPr>
-              <w:t xml:space="preserve">Provides a reasonable explanation of the phenomenon that integrates knowledge from at least three lessons. The central principle (structure determines function) is implied but may not be explicitly stated. Writing is mostly organised and uses some scientific vocabulary. Meets the word count requirement. Minor factual errors or omissions do not undermine the overall explanation.</w:t>
+              <w:t xml:space="preserve">Student's reasoning is generally logical and arguments are mostly well-structured. Some sections may be less developed or organised than others, but the overall explanation is clear and scientifically sound. Minor grammatical or organisational issues do not significantly impede communication.</w:t>
             </w:r>
           </w:p>
         </w:tc>
@@ -2280,7 +1900,7 @@
                 <w:sz w:val="18"/>
                 <w:szCs w:val="18"/>
               </w:rPr>
-              <w:t xml:space="preserve">Provides a partial or superficial explanation of the phenomenon with reference to only one or two lessons. The connection between molecular structure and biological function is absent or unclear. Writing is disorganised or lacks scientific vocabulary. May not meet the minimum word count, or contains multiple significant factual errors that undermine the explanation.</w:t>
+              <w:t xml:space="preserve">Student's reasoning is unclear, incomplete, or illogical in multiple sections. Arguments are poorly organised or consist of disconnected statements. The student relies heavily on memorised phrases without demonstrating understanding. Writing issues frequently impede comprehension of the scientific ideas.</w:t>
             </w:r>
           </w:p>
         </w:tc>

</xml_diff>